<commit_message>
correction erreurs fr 1
</commit_message>
<xml_diff>
--- a/Rapports_mensuels/Mois2026_02/ipc_note_08_ar_2026_02.docx
+++ b/Rapports_mensuels/Mois2026_02/ipc_note_08_ar_2026_02.docx
@@ -37,7 +37,19 @@
         <w:pStyle w:val="ipccorps"/>
       </w:pPr>
       <w:r>
-        <w:t xml:space="preserve">على المستوى الشهري ارتفع الرقم الاستدلالي للمواد الغذائية ب 2.3% في شهر فبراير 2026 مقارنة بشهر يناير .2026 ويعزى ذلك الى زيادة أثمان</w:t>
+        <w:t xml:space="preserve">على المستوى الشهري ارتفع الرقم الاستدلالي للمواد الغذائية ب</w:t>
+      </w:r>
+      <w:r>
+        <w:t xml:space="preserve"> </w:t>
+      </w:r>
+      <w:r>
+        <w:t xml:space="preserve">2.3%</w:t>
+      </w:r>
+      <w:r>
+        <w:t xml:space="preserve"> </w:t>
+      </w:r>
+      <w:r>
+        <w:t xml:space="preserve">في شهر فبراير 2026 مقارنة بشهر يناير .2026 ويعزى ذلك الى زيادة أثمان</w:t>
       </w:r>
       <w:r>
         <w:t xml:space="preserve"> </w:t>
@@ -50,10 +62,7 @@
         <w:t xml:space="preserve">الأسماك والمأكولات البحرية</w:t>
       </w:r>
       <w:r>
-        <w:t xml:space="preserve"> </w:t>
-      </w:r>
-      <w:r>
-        <w:t xml:space="preserve">ب 6.9 % ‏،</w:t>
+        <w:t xml:space="preserve">ب6.9% ‏،</w:t>
       </w:r>
       <w:r>
         <w:t xml:space="preserve"> </w:t>
@@ -66,10 +75,7 @@
         <w:t xml:space="preserve">الخضراوات</w:t>
       </w:r>
       <w:r>
-        <w:t xml:space="preserve"> </w:t>
-      </w:r>
-      <w:r>
-        <w:t xml:space="preserve">ب 5.9 % ‏،</w:t>
+        <w:t xml:space="preserve">ب5.9% ‏،</w:t>
       </w:r>
       <w:r>
         <w:t xml:space="preserve"> </w:t>
@@ -82,10 +88,7 @@
         <w:t xml:space="preserve">الفواكه</w:t>
       </w:r>
       <w:r>
-        <w:t xml:space="preserve"> </w:t>
-      </w:r>
-      <w:r>
-        <w:t xml:space="preserve">ب 5.5 % ‏،</w:t>
+        <w:t xml:space="preserve">ب5.5% ‏،</w:t>
       </w:r>
       <w:r>
         <w:t xml:space="preserve"> </w:t>
@@ -98,10 +101,7 @@
         <w:t xml:space="preserve">مقهى، شاي وكاكاو</w:t>
       </w:r>
       <w:r>
-        <w:t xml:space="preserve"> </w:t>
-      </w:r>
-      <w:r>
-        <w:t xml:space="preserve">ب 2.3 % ‏،</w:t>
+        <w:t xml:space="preserve">ب2.3% ‏،</w:t>
       </w:r>
       <w:r>
         <w:t xml:space="preserve"> </w:t>
@@ -114,10 +114,7 @@
         <w:t xml:space="preserve">اللحم</w:t>
       </w:r>
       <w:r>
-        <w:t xml:space="preserve"> </w:t>
-      </w:r>
-      <w:r>
-        <w:t xml:space="preserve">ب 2 % ‏،</w:t>
+        <w:t xml:space="preserve">ب2% ‏،</w:t>
       </w:r>
       <w:r>
         <w:t xml:space="preserve"> </w:t>
@@ -133,7 +130,20 @@
         <w:t xml:space="preserve"> </w:t>
       </w:r>
       <w:r>
-        <w:t xml:space="preserve">ب 0.7 % ‏،</w:t>
+        <w:t xml:space="preserve">و</w:t>
+      </w:r>
+      <w:r>
+        <w:t xml:space="preserve"> </w:t>
+      </w:r>
+      <w:r>
+        <w:rPr>
+          <w:b/>
+          <w:bCs/>
+        </w:rPr>
+        <w:t xml:space="preserve">خدمات تقديم الطعام</w:t>
+      </w:r>
+      <w:r>
+        <w:t xml:space="preserve">ب0.7% ‏،</w:t>
       </w:r>
       <w:r>
         <w:t xml:space="preserve"> </w:t>
@@ -146,10 +156,7 @@
         <w:t xml:space="preserve">مواد غذائية غير مصنفة في مكان آخر</w:t>
       </w:r>
       <w:r>
-        <w:t xml:space="preserve"> </w:t>
-      </w:r>
-      <w:r>
-        <w:t xml:space="preserve">ب 0.4 % ‏،</w:t>
+        <w:t xml:space="preserve">ب0.4% ‏ و</w:t>
       </w:r>
       <w:r>
         <w:t xml:space="preserve"> </w:t>
@@ -162,10 +169,7 @@
         <w:t xml:space="preserve">الحليب والجبن والبيض</w:t>
       </w:r>
       <w:r>
-        <w:t xml:space="preserve"> </w:t>
-      </w:r>
-      <w:r>
-        <w:t xml:space="preserve">ب 0.3 % ‏</w:t>
+        <w:t xml:space="preserve">ب0.3% ‏</w:t>
       </w:r>
     </w:p>
     <w:p>
@@ -173,7 +177,7 @@
         <w:pStyle w:val="ipccorps"/>
       </w:pPr>
       <w:r>
-        <w:t xml:space="preserve">كما ارتفع التغير الشهري للرقم الاستدلالي للمواد غير الغذائية ب (0.2% ) جراء زيادة أثمان الأقسام التالية:</w:t>
+        <w:t xml:space="preserve">كما، ارتفع التغير الشهري للرقم الاستدلالي للمواد غير الغذائية ب (0.2% ) جراء زيادة أثمان الأقسام التالية:</w:t>
       </w:r>
       <w:r>
         <w:t xml:space="preserve"> </w:t>
@@ -186,10 +190,7 @@
         <w:t xml:space="preserve">مواصلات</w:t>
       </w:r>
       <w:r>
-        <w:t xml:space="preserve"> </w:t>
-      </w:r>
-      <w:r>
-        <w:t xml:space="preserve">ب 1.2 % ‏،</w:t>
+        <w:t xml:space="preserve">ب1.2% ‏ و</w:t>
       </w:r>
       <w:r>
         <w:t xml:space="preserve"> </w:t>
@@ -202,10 +203,7 @@
         <w:t xml:space="preserve">سلع وخدمات متنوعة</w:t>
       </w:r>
       <w:r>
-        <w:t xml:space="preserve"> </w:t>
-      </w:r>
-      <w:r>
-        <w:t xml:space="preserve">ب 0.7 % ‏ .</w:t>
+        <w:t xml:space="preserve">ب0.7% ‏ .</w:t>
       </w:r>
     </w:p>
     <w:p>
@@ -239,10 +237,7 @@
         <w:t xml:space="preserve">الأسماك والمأكولات البحرية</w:t>
       </w:r>
       <w:r>
-        <w:t xml:space="preserve"> </w:t>
-      </w:r>
-      <w:r>
-        <w:t xml:space="preserve">ب 15.4 % ‏،</w:t>
+        <w:t xml:space="preserve">ب15.4% ‏،</w:t>
       </w:r>
       <w:r>
         <w:t xml:space="preserve"> </w:t>
@@ -255,10 +250,7 @@
         <w:t xml:space="preserve">الخضراوات</w:t>
       </w:r>
       <w:r>
-        <w:t xml:space="preserve"> </w:t>
-      </w:r>
-      <w:r>
-        <w:t xml:space="preserve">ب 14.4 % ‏،</w:t>
+        <w:t xml:space="preserve">ب14.4% ‏،</w:t>
       </w:r>
       <w:r>
         <w:t xml:space="preserve"> </w:t>
@@ -271,10 +263,7 @@
         <w:t xml:space="preserve">مقهى، شاي وكاكاو</w:t>
       </w:r>
       <w:r>
-        <w:t xml:space="preserve"> </w:t>
-      </w:r>
-      <w:r>
-        <w:t xml:space="preserve">ب 6.2 % ‏،</w:t>
+        <w:t xml:space="preserve">ب6.2% ‏،</w:t>
       </w:r>
       <w:r>
         <w:t xml:space="preserve"> </w:t>
@@ -287,10 +276,7 @@
         <w:t xml:space="preserve">الفواكه</w:t>
       </w:r>
       <w:r>
-        <w:t xml:space="preserve"> </w:t>
-      </w:r>
-      <w:r>
-        <w:t xml:space="preserve">ب 4.5 % ‏،</w:t>
+        <w:t xml:space="preserve">ب4.5% ‏،</w:t>
       </w:r>
       <w:r>
         <w:t xml:space="preserve"> </w:t>
@@ -303,10 +289,7 @@
         <w:t xml:space="preserve">التبغ</w:t>
       </w:r>
       <w:r>
-        <w:t xml:space="preserve"> </w:t>
-      </w:r>
-      <w:r>
-        <w:t xml:space="preserve">ب 3.7 % ‏،</w:t>
+        <w:t xml:space="preserve">ب3.7% ‏،</w:t>
       </w:r>
       <w:r>
         <w:t xml:space="preserve"> </w:t>
@@ -319,10 +302,7 @@
         <w:t xml:space="preserve">مواد غذائية غير مصنفة في مكان آخر</w:t>
       </w:r>
       <w:r>
-        <w:t xml:space="preserve"> </w:t>
-      </w:r>
-      <w:r>
-        <w:t xml:space="preserve">ب 1 % ‏،</w:t>
+        <w:t xml:space="preserve">ب1% ‏ و</w:t>
       </w:r>
       <w:r>
         <w:t xml:space="preserve"> </w:t>
@@ -335,10 +315,7 @@
         <w:t xml:space="preserve">السكر، والمربى، والعسل، والشوكولاتة، والحلويات</w:t>
       </w:r>
       <w:r>
-        <w:t xml:space="preserve"> </w:t>
-      </w:r>
-      <w:r>
-        <w:t xml:space="preserve">ب 0.8 % ‏. وعلى الرغم من الانخفاضات المسجلة في أثمان المواد</w:t>
+        <w:t xml:space="preserve">ب0.8% ‏. وعلى الرغم من الانخفاضات المسجلة في أثمان المواد</w:t>
       </w:r>
       <w:r>
         <w:t xml:space="preserve"> </w:t>
@@ -357,10 +334,7 @@
         <w:t xml:space="preserve">الزيوت والدهون</w:t>
       </w:r>
       <w:r>
-        <w:t xml:space="preserve"> </w:t>
-      </w:r>
-      <w:r>
-        <w:t xml:space="preserve">ب -14.3 % ‏،</w:t>
+        <w:t xml:space="preserve">ب14.3% ‏،</w:t>
       </w:r>
       <w:r>
         <w:t xml:space="preserve"> </w:t>
@@ -373,10 +347,7 @@
         <w:t xml:space="preserve">اللحم</w:t>
       </w:r>
       <w:r>
-        <w:t xml:space="preserve"> </w:t>
-      </w:r>
-      <w:r>
-        <w:t xml:space="preserve">ب -7.4 % ‏،</w:t>
+        <w:t xml:space="preserve">ب7.4% ‏،</w:t>
       </w:r>
       <w:r>
         <w:t xml:space="preserve"> </w:t>
@@ -389,10 +360,7 @@
         <w:t xml:space="preserve">الحليب والجبن والبيض</w:t>
       </w:r>
       <w:r>
-        <w:t xml:space="preserve"> </w:t>
-      </w:r>
-      <w:r>
-        <w:t xml:space="preserve">ب -0.8 % ‏،</w:t>
+        <w:t xml:space="preserve">ب0.8% ‏ و</w:t>
       </w:r>
       <w:r>
         <w:t xml:space="preserve"> </w:t>
@@ -408,7 +376,20 @@
         <w:t xml:space="preserve"> </w:t>
       </w:r>
       <w:r>
-        <w:t xml:space="preserve">ب -0.6 % ‏ و كذا</w:t>
+        <w:t xml:space="preserve">و</w:t>
+      </w:r>
+      <w:r>
+        <w:t xml:space="preserve"> </w:t>
+      </w:r>
+      <w:r>
+        <w:rPr>
+          <w:b/>
+          <w:bCs/>
+        </w:rPr>
+        <w:t xml:space="preserve">خدمات تقديم الطعام</w:t>
+      </w:r>
+      <w:r>
+        <w:t xml:space="preserve">ب0.6% ‏ و كذا</w:t>
       </w:r>
       <w:r>
         <w:t xml:space="preserve"> </w:t>
@@ -427,10 +408,7 @@
         <w:t xml:space="preserve">المياه المعدنية، والمشروبات الغازية، وعصائر الفاكهة والخضراوات (بدون تاريخ)</w:t>
       </w:r>
       <w:r>
-        <w:t xml:space="preserve"> </w:t>
-      </w:r>
-      <w:r>
-        <w:t xml:space="preserve">فإن ذلك لم يؤثر على التطور</w:t>
+        <w:t xml:space="preserve">ب0% ‏ فإن ذلك لم يؤثر على التطور</w:t>
       </w:r>
       <w:r>
         <w:t xml:space="preserve"> </w:t>
@@ -457,10 +435,7 @@
         <w:t xml:space="preserve">مواصلات</w:t>
       </w:r>
       <w:r>
-        <w:t xml:space="preserve"> </w:t>
-      </w:r>
-      <w:r>
-        <w:t xml:space="preserve">ب -4.5 % ‏ بينما ارتفع</w:t>
+        <w:t xml:space="preserve">ب4.5% ‏ بينما ارتفع</w:t>
       </w:r>
       <w:r>
         <w:t xml:space="preserve"> </w:t>
@@ -473,10 +448,7 @@
         <w:t xml:space="preserve">تعليم</w:t>
       </w:r>
       <w:r>
-        <w:t xml:space="preserve"> </w:t>
-      </w:r>
-      <w:r>
-        <w:t xml:space="preserve">ب 10.9 % ‏</w:t>
+        <w:t xml:space="preserve">ب10.9% ‏</w:t>
       </w:r>
     </w:p>
     <w:p>

</xml_diff>